<commit_message>
Nueva plantilla para reporte territorial
</commit_message>
<xml_diff>
--- a/storage/templates/reportes/Informacion_territorial/Plantilla Reporte Información territorial.docx
+++ b/storage/templates/reportes/Informacion_territorial/Plantilla Reporte Información territorial.docx
@@ -14,12 +14,36 @@
     </w:p>
     <w:sectPr>
       <w:headerReference r:id="rId6" w:type="default"/>
+      <w:footerReference r:id="rId7" w:type="default"/>
       <w:pgSz w:h="16834" w:w="11909" w:orient="portrait"/>
       <w:pgMar w:bottom="1440" w:top="1440" w:left="1440" w:right="1440" w:header="720" w:footer="720"/>
       <w:pgNumType w:start="1"/>
     </w:sectPr>
   </w:body>
 </w:document>
+</file>
+
+<file path=word/footer1.xml><?xml version="1.0" encoding="utf-8"?>
+<w:ftr xmlns:mc="http://schemas.openxmlformats.org/markup-compatibility/2006" xmlns:o="urn:schemas-microsoft-com:office:office" xmlns:r="http://schemas.openxmlformats.org/officeDocument/2006/relationships" xmlns:m="http://schemas.openxmlformats.org/officeDocument/2006/math" xmlns:v="urn:schemas-microsoft-com:vml" xmlns:wp="http://schemas.openxmlformats.org/drawingml/2006/wordprocessingDrawing" xmlns:w10="urn:schemas-microsoft-com:office:word" xmlns:w="http://schemas.openxmlformats.org/wordprocessingml/2006/main" xmlns:wne="http://schemas.microsoft.com/office/word/2006/wordml" xmlns:sl="http://schemas.openxmlformats.org/schemaLibrary/2006/main" xmlns:a="http://schemas.openxmlformats.org/drawingml/2006/main" xmlns:pic="http://schemas.openxmlformats.org/drawingml/2006/picture" xmlns:c="http://schemas.openxmlformats.org/drawingml/2006/chart" xmlns:lc="http://schemas.openxmlformats.org/drawingml/2006/lockedCanvas" xmlns:dgm="http://schemas.openxmlformats.org/drawingml/2006/diagram" xmlns:wps="http://schemas.microsoft.com/office/word/2010/wordprocessingShape" xmlns:wpg="http://schemas.microsoft.com/office/word/2010/wordprocessingGroup" xmlns:w14="http://schemas.microsoft.com/office/word/2010/wordml" xmlns:w15="http://schemas.microsoft.com/office/word/2012/wordml" xmlns:w16="http://schemas.microsoft.com/office/word/2018/wordml" xmlns:w16cex="http://schemas.microsoft.com/office/word/2018/wordml/cex" xmlns:w16cid="http://schemas.microsoft.com/office/word/2016/wordml/cid" xmlns="http://schemas.microsoft.com/office/tasks/2019/documenttasks" xmlns:cr="http://schemas.microsoft.com/office/comments/2020/reactions">
+  <w:p>
+    <w:pPr>
+      <w:jc w:val="right"/>
+      <w:rPr/>
+    </w:pPr>
+    <w:r>
+      <w:rPr/>
+      <w:fldChar w:fldCharType="begin"/>
+      <w:instrText xml:space="preserve">PAGE</w:instrText>
+      <w:fldChar w:fldCharType="separate"/>
+      <w:fldChar w:fldCharType="end"/>
+    </w:r>
+    <w:r>
+      <w:rPr>
+        <w:rtl w:val="0"/>
+      </w:rPr>
+    </w:r>
+  </w:p>
+</w:ftr>
 </file>
 
 <file path=word/header1.xml><?xml version="1.0" encoding="utf-8"?>
@@ -38,10 +62,10 @@
         <wp:anchor allowOverlap="1" behindDoc="0" distB="114300" distT="114300" distL="114300" distR="114300" hidden="0" layoutInCell="1" locked="0" relativeHeight="0" simplePos="0">
           <wp:simplePos x="0" y="0"/>
           <wp:positionH relativeFrom="column">
-            <wp:posOffset>-712799</wp:posOffset>
+            <wp:posOffset>-388799</wp:posOffset>
           </wp:positionH>
           <wp:positionV relativeFrom="paragraph">
-            <wp:posOffset>-280799</wp:posOffset>
+            <wp:posOffset>-136799</wp:posOffset>
           </wp:positionV>
           <wp:extent cx="1197618" cy="1100138"/>
           <wp:effectExtent b="0" l="0" r="0" t="0"/>
@@ -74,6 +98,16 @@
           </a:graphic>
         </wp:anchor>
       </w:drawing>
+    </w:r>
+  </w:p>
+  <w:p>
+    <w:pPr>
+      <w:rPr/>
+    </w:pPr>
+    <w:r>
+      <w:rPr>
+        <w:rtl w:val="0"/>
+      </w:rPr>
     </w:r>
   </w:p>
 </w:hdr>

</xml_diff>

<commit_message>
Nueva plantilla para reporte territorial 2
</commit_message>
<xml_diff>
--- a/storage/templates/reportes/Informacion_territorial/Plantilla Reporte Información territorial.docx
+++ b/storage/templates/reportes/Informacion_territorial/Plantilla Reporte Información territorial.docx
@@ -50,26 +50,15 @@
 <w:hdr xmlns:mc="http://schemas.openxmlformats.org/markup-compatibility/2006" xmlns:o="urn:schemas-microsoft-com:office:office" xmlns:r="http://schemas.openxmlformats.org/officeDocument/2006/relationships" xmlns:m="http://schemas.openxmlformats.org/officeDocument/2006/math" xmlns:v="urn:schemas-microsoft-com:vml" xmlns:wp="http://schemas.openxmlformats.org/drawingml/2006/wordprocessingDrawing" xmlns:w10="urn:schemas-microsoft-com:office:word" xmlns:w="http://schemas.openxmlformats.org/wordprocessingml/2006/main" xmlns:wne="http://schemas.microsoft.com/office/word/2006/wordml" xmlns:sl="http://schemas.openxmlformats.org/schemaLibrary/2006/main" xmlns:a="http://schemas.openxmlformats.org/drawingml/2006/main" xmlns:pic="http://schemas.openxmlformats.org/drawingml/2006/picture" xmlns:c="http://schemas.openxmlformats.org/drawingml/2006/chart" xmlns:lc="http://schemas.openxmlformats.org/drawingml/2006/lockedCanvas" xmlns:dgm="http://schemas.openxmlformats.org/drawingml/2006/diagram" xmlns:wps="http://schemas.microsoft.com/office/word/2010/wordprocessingShape" xmlns:wpg="http://schemas.microsoft.com/office/word/2010/wordprocessingGroup" xmlns:w14="http://schemas.microsoft.com/office/word/2010/wordml" xmlns:w15="http://schemas.microsoft.com/office/word/2012/wordml" xmlns:w16="http://schemas.microsoft.com/office/word/2018/wordml" xmlns:w16cex="http://schemas.microsoft.com/office/word/2018/wordml/cex" xmlns:w16cid="http://schemas.microsoft.com/office/word/2016/wordml/cid" xmlns="http://schemas.microsoft.com/office/tasks/2019/documenttasks" xmlns:cr="http://schemas.microsoft.com/office/comments/2020/reactions">
   <w:p>
     <w:pPr>
+      <w:jc w:val="center"/>
       <w:rPr/>
     </w:pPr>
     <w:r>
-      <w:rPr>
-        <w:rtl w:val="0"/>
-      </w:rPr>
-    </w:r>
-    <w:r>
+      <w:rPr/>
       <w:drawing>
-        <wp:anchor allowOverlap="1" behindDoc="0" distB="114300" distT="114300" distL="114300" distR="114300" hidden="0" layoutInCell="1" locked="0" relativeHeight="0" simplePos="0">
-          <wp:simplePos x="0" y="0"/>
-          <wp:positionH relativeFrom="column">
-            <wp:posOffset>-388799</wp:posOffset>
-          </wp:positionH>
-          <wp:positionV relativeFrom="paragraph">
-            <wp:posOffset>-136799</wp:posOffset>
-          </wp:positionV>
-          <wp:extent cx="1197618" cy="1100138"/>
+        <wp:inline distB="114300" distT="114300" distL="114300" distR="114300">
+          <wp:extent cx="1243013" cy="1137428"/>
           <wp:effectExtent b="0" l="0" r="0" t="0"/>
-          <wp:wrapSquare wrapText="bothSides" distB="114300" distT="114300" distL="114300" distR="114300"/>
           <wp:docPr id="1" name="image1.png"/>
           <a:graphic>
             <a:graphicData uri="http://schemas.openxmlformats.org/drawingml/2006/picture">
@@ -88,7 +77,7 @@
                 <pic:spPr>
                   <a:xfrm>
                     <a:off x="0" y="0"/>
-                    <a:ext cx="1197618" cy="1100138"/>
+                    <a:ext cx="1243013" cy="1137428"/>
                   </a:xfrm>
                   <a:prstGeom prst="rect"/>
                   <a:ln/>
@@ -96,12 +85,18 @@
               </pic:pic>
             </a:graphicData>
           </a:graphic>
-        </wp:anchor>
+        </wp:inline>
       </w:drawing>
+    </w:r>
+    <w:r>
+      <w:rPr>
+        <w:rtl w:val="0"/>
+      </w:rPr>
     </w:r>
   </w:p>
   <w:p>
     <w:pPr>
+      <w:jc w:val="right"/>
       <w:rPr/>
     </w:pPr>
     <w:r>

</xml_diff>